<commit_message>
paper v2+: related work + capacity appendix
</commit_message>
<xml_diff>
--- a/paper/MEGA27-23b-dna-encoder-cyborg-cell-v2.docx
+++ b/paper/MEGA27-23b-dna-encoder-cyborg-cell-v2.docx
@@ -102,6 +102,32 @@
     <w:p>
       <w:r>
         <w:t>pip install -e . &amp;&amp; pytest - 10 tests pin every claimed property (round-trips, worst-case homopolymer exactly 1, GC window, noise recovery, loud corruption rejection, steady-state match, bound monotonicity).</w:t>
+      </w:r>
+    </w:p>
+    <w:p>
+      <w:pPr>
+        <w:pStyle w:val="Heading1"/>
+      </w:pPr>
+      <w:r>
+        <w:t>Related work</w:t>
+      </w:r>
+    </w:p>
+    <w:p>
+      <w:r>
+        <w:t>DNA storage passed the practicability threshold with Goldman (2013) and Grass (2015); later work raised density with fountain codes (Erlich 2017) and added enzymatic synthesis. Our angle is different: guarantees by construction (homopolymer impossibility) rather than post-hoc screening, at a known capacity price (1.585 of 2.0 bits/nt), plus loud integrity failure - the properties a teaching or field kit actually needs. The cyborg-cell model sits in the metabolic-burden literature (synthetic circuit load on host growth); the reallocation bound is the kind of back-of-envelope theorem that literature uses but rarely pins with a verified simulation match.</w:t>
+      </w:r>
+    </w:p>
+    <w:p>
+      <w:pPr>
+        <w:pStyle w:val="Heading1"/>
+      </w:pPr>
+      <w:r>
+        <w:t>Appendix - capacity and overhead accounting</w:t>
+      </w:r>
+    </w:p>
+    <w:p>
+      <w:r>
+        <w:t>Per payload byte: 6 trits data; per message: 12 trits length header + 12 trits checksum; x3 replication. Net density for the 37-byte demo: 37x8 = 296 bits in 3 x 246 nt = 738 nt, 0.40 bits/nt synthesized; per unique strand 1.20 bits/nt (296/246), vs the 1.585 code maximum - the gap is framing overhead, which amortizes for payloads longer than ~100 bytes.</w:t>
       </w:r>
     </w:p>
     <w:p>

</xml_diff>